<commit_message>
Keep internal capture terms out of quotations
</commit_message>
<xml_diff>
--- a/templates/roofsignal-offerte-template.docx
+++ b/templates/roofsignal-offerte-template.docx
@@ -1433,8 +1433,8 @@
     <w:p>
       <w:pPr>
         <w:pStyle w:val="Heading1"/>
-        <w:keepNext w:val="0"/>
-        <w:spacing w:before="200" w:after="100" w:line="240" w:lineRule="auto"/>
+        <w:keepNext/>
+        <w:spacing w:before="280" w:after="120" w:line="240" w:lineRule="auto"/>
       </w:pPr>
       <w:r>
         <w:rPr>
@@ -1552,8 +1552,8 @@
     <w:p>
       <w:pPr>
         <w:pStyle w:val="Heading1"/>
-        <w:keepNext w:val="0"/>
-        <w:spacing w:before="200" w:after="100" w:line="240" w:lineRule="auto"/>
+        <w:keepNext/>
+        <w:spacing w:before="280" w:after="120" w:line="240" w:lineRule="auto"/>
       </w:pPr>
       <w:r>
         <w:rPr>
@@ -1570,8 +1570,6 @@
       <w:pPr>
         <w:keepNext w:val="0"/>
         <w:spacing w:before="0" w:after="120" w:line="264" w:lineRule="auto"/>
-        <w:ind w:left="0" w:firstLine="0"/>
-        <w:jc w:val="left"/>
       </w:pPr>
       <w:r>
         <w:rPr>
@@ -1587,8 +1585,8 @@
     <w:p>
       <w:pPr>
         <w:pStyle w:val="Heading1"/>
-        <w:keepNext w:val="0"/>
-        <w:spacing w:before="200" w:after="100" w:line="240" w:lineRule="auto"/>
+        <w:keepNext/>
+        <w:spacing w:before="280" w:after="120" w:line="240" w:lineRule="auto"/>
       </w:pPr>
       <w:r>
         <w:rPr>
@@ -1605,8 +1603,6 @@
       <w:pPr>
         <w:keepNext w:val="0"/>
         <w:spacing w:before="0" w:after="120" w:line="264" w:lineRule="auto"/>
-        <w:ind w:left="0" w:firstLine="0"/>
-        <w:jc w:val="left"/>
       </w:pPr>
       <w:r>
         <w:rPr>
@@ -1622,8 +1618,8 @@
     <w:p>
       <w:pPr>
         <w:pStyle w:val="Heading1"/>
-        <w:keepNext w:val="0"/>
-        <w:spacing w:before="200" w:after="100" w:line="240" w:lineRule="auto"/>
+        <w:keepNext/>
+        <w:spacing w:before="280" w:after="120" w:line="240" w:lineRule="auto"/>
       </w:pPr>
       <w:r>
         <w:rPr>
@@ -1640,8 +1636,6 @@
       <w:pPr>
         <w:keepNext w:val="0"/>
         <w:spacing w:before="0" w:after="240" w:line="264" w:lineRule="auto"/>
-        <w:ind w:left="0" w:firstLine="0"/>
-        <w:jc w:val="left"/>
       </w:pPr>
       <w:r>
         <w:rPr>

</xml_diff>

<commit_message>
Add verifiable digital quote execution
</commit_message>
<xml_diff>
--- a/templates/roofsignal-offerte-template.docx
+++ b/templates/roofsignal-offerte-template.docx
@@ -1645,7 +1645,7 @@
           <w:color w:val="101312"/>
           <w:sz w:val="21"/>
         </w:rPr>
-        <w:t>Door ondertekening geeft opdrachtgever akkoord op de beschreven scope, investering en uitgangspunten.</w:t>
+        <w:t>RoofSignal brengt deze offerte digitaal uit. Het akkoord van de opdrachtgever wordt met naam, datum, tijd en offerteversie vastgelegd.</w:t>
       </w:r>
     </w:p>
     <w:tbl>
@@ -1748,7 +1748,7 @@
               <w:spacing w:before="0" w:after="40" w:line="240" w:lineRule="auto"/>
             </w:pPr>
             <w:r>
-              <w:t>Naam: [naam opdrachtgever]</w:t>
+              <w:t>Digitale acceptatie volgt via de akkoordpagina.</w:t>
             </w:r>
             <w:r>
               <w:rPr>
@@ -1778,7 +1778,7 @@
               <w:spacing w:before="0" w:after="40" w:line="240" w:lineRule="auto"/>
             </w:pPr>
             <w:r>
-              <w:t>Naam: F.J. Joosten</w:t>
+              <w:t>Wordt digitaal uitgebracht bij verzending.</w:t>
             </w:r>
             <w:r>
               <w:rPr>
@@ -1809,7 +1809,9 @@
               <w:keepNext w:val="0"/>
               <w:spacing w:before="0" w:after="320" w:line="240" w:lineRule="auto"/>
             </w:pPr>
-            <w:r/>
+            <w:r>
+              <w:t>Naam, datum en tijd worden automatisch vastgelegd.</w:t>
+            </w:r>
             <w:r>
               <w:rPr>
                 <w:rFonts w:ascii="Arial" w:hAnsi="Arial"/>
@@ -1818,7 +1820,6 @@
                 <w:color w:val="59615E"/>
                 <w:sz w:val="19"/>
               </w:rPr>
-              <w:t>Datum / handtekening:</w:t>
             </w:r>
           </w:p>
         </w:tc>
@@ -1838,7 +1839,9 @@
               <w:keepNext w:val="0"/>
               <w:spacing w:before="0" w:after="320" w:line="240" w:lineRule="auto"/>
             </w:pPr>
-            <w:r/>
+            <w:r>
+              <w:t>Namens RoofSignal: F.J. Joosten</w:t>
+            </w:r>
             <w:r>
               <w:rPr>
                 <w:rFonts w:ascii="Arial" w:hAnsi="Arial"/>
@@ -1847,7 +1850,6 @@
                 <w:color w:val="59615E"/>
                 <w:sz w:val="19"/>
               </w:rPr>
-              <w:t>Datum / handtekening:</w:t>
             </w:r>
           </w:p>
         </w:tc>

</xml_diff>